<commit_message>
Instalador Inno Setup, flujo de GitHub Actions y manuales detallados con imagenes
Co-Authored-By: Claude Sonnet 5.5 <noreply@anthropic.com>
Claude-Session: https://claude.ai/code/session_01UKpqBxWMxzkmJmMnUb2UZS
</commit_message>
<xml_diff>
--- a/ContaBol/docs/Manual_Implementacion.docx
+++ b/ContaBol/docs/Manual_Implementacion.docx
@@ -2,22 +2,158 @@
 <file path=word/document.xml><?xml version="1.0" encoding="utf-8"?>
 <w:document xmlns:w="http://schemas.openxmlformats.org/wordprocessingml/2006/main" xmlns:m="http://schemas.openxmlformats.org/officeDocument/2006/math" xmlns:r="http://schemas.openxmlformats.org/officeDocument/2006/relationships" xmlns:o="urn:schemas-microsoft-com:office:office" xmlns:v="urn:schemas-microsoft-com:vml" xmlns:w10="urn:schemas-microsoft-com:office:word" xmlns:a="http://schemas.openxmlformats.org/drawingml/2006/main" xmlns:pic="http://schemas.openxmlformats.org/drawingml/2006/picture" xmlns:wp="http://schemas.openxmlformats.org/drawingml/2006/wordprocessingDrawing">
   <w:body>
-    <w:bookmarkStart w:id="30" w:name="contabol-manual-de-implementación"/>
-    <w:p>
-      <w:pPr>
-        <w:pStyle w:val="Heading1"/>
-      </w:pPr>
-      <w:r>
-        <w:t xml:space="preserve">ContaBol — Manual de implementación</w:t>
-      </w:r>
-    </w:p>
-    <w:bookmarkStart w:id="20" w:name="arquitectura"/>
+    <w:p>
+      <w:pPr>
+        <w:pStyle w:val="Title"/>
+      </w:pPr>
+      <w:r>
+        <w:t xml:space="preserve">ContaBol</w:t>
+      </w:r>
+      <w:r>
+        <w:t xml:space="preserve"> </w:t>
+      </w:r>
+      <w:r>
+        <w:t xml:space="preserve">—</w:t>
+      </w:r>
+      <w:r>
+        <w:t xml:space="preserve"> </w:t>
+      </w:r>
+      <w:r>
+        <w:t xml:space="preserve">Manual</w:t>
+      </w:r>
+      <w:r>
+        <w:t xml:space="preserve"> </w:t>
+      </w:r>
+      <w:r>
+        <w:t xml:space="preserve">de</w:t>
+      </w:r>
+      <w:r>
+        <w:t xml:space="preserve"> </w:t>
+      </w:r>
+      <w:r>
+        <w:t xml:space="preserve">implementación</w:t>
+      </w:r>
+    </w:p>
+    <w:p>
+      <w:pPr>
+        <w:pStyle w:val="Subtitle"/>
+      </w:pPr>
+      <w:r>
+        <w:t xml:space="preserve">Instalación,</w:t>
+      </w:r>
+      <w:r>
+        <w:t xml:space="preserve"> </w:t>
+      </w:r>
+      <w:r>
+        <w:t xml:space="preserve">configuración,</w:t>
+      </w:r>
+      <w:r>
+        <w:t xml:space="preserve"> </w:t>
+      </w:r>
+      <w:r>
+        <w:t xml:space="preserve">despliegue</w:t>
+      </w:r>
+      <w:r>
+        <w:t xml:space="preserve"> </w:t>
+      </w:r>
+      <w:r>
+        <w:t xml:space="preserve">y</w:t>
+      </w:r>
+      <w:r>
+        <w:t xml:space="preserve"> </w:t>
+      </w:r>
+      <w:r>
+        <w:t xml:space="preserve">mantenimiento</w:t>
+      </w:r>
+    </w:p>
+    <w:sdt>
+      <w:sdtPr>
+        <w:docPartObj>
+          <w:docPartGallery w:val="Table of Contents"/>
+          <w:docPartUnique/>
+        </w:docPartObj>
+      </w:sdtPr>
+      <w:sdtContent>
+        <w:p>
+          <w:pPr>
+            <w:pStyle w:val="TOCHeading"/>
+          </w:pPr>
+          <w:r>
+            <w:t xml:space="preserve">Table of Contents</w:t>
+          </w:r>
+        </w:p>
+        <w:p>
+          <w:r>
+            <w:fldChar w:fldCharType="begin" w:dirty="true"/>
+            <w:instrText xml:space="preserve">TOC \o "1-2" \h \z \u</w:instrText>
+            <w:fldChar w:fldCharType="separate"/>
+            <w:fldChar w:fldCharType="end"/>
+          </w:r>
+        </w:p>
+      </w:sdtContent>
+    </w:sdt>
+    <w:bookmarkStart w:id="23" w:name="arquitectura"/>
     <w:p>
       <w:pPr>
         <w:pStyle w:val="Heading2"/>
       </w:pPr>
       <w:r>
         <w:t xml:space="preserve">1. Arquitectura</w:t>
+      </w:r>
+    </w:p>
+    <w:p>
+      <w:pPr>
+        <w:pStyle w:val="CaptionedFigure"/>
+      </w:pPr>
+      <w:r>
+        <w:drawing>
+          <wp:inline>
+            <wp:extent cx="5334000" cy="2785533"/>
+            <wp:effectExtent b="0" l="0" r="0" t="0"/>
+            <wp:docPr descr="Arquitectura" title="" id="21" name="Picture"/>
+            <a:graphic>
+              <a:graphicData uri="http://schemas.openxmlformats.org/drawingml/2006/picture">
+                <pic:pic>
+                  <pic:nvPicPr>
+                    <pic:cNvPr descr="img/arquitectura.png" id="22" name="Picture"/>
+                    <pic:cNvPicPr>
+                      <a:picLocks noChangeArrowheads="1" noChangeAspect="1"/>
+                    </pic:cNvPicPr>
+                  </pic:nvPicPr>
+                  <pic:blipFill>
+                    <a:blip r:embed="rId20"/>
+                    <a:stretch>
+                      <a:fillRect/>
+                    </a:stretch>
+                  </pic:blipFill>
+                  <pic:spPr bwMode="auto">
+                    <a:xfrm>
+                      <a:off x="0" y="0"/>
+                      <a:ext cx="5334000" cy="2785533"/>
+                    </a:xfrm>
+                    <a:prstGeom prst="rect">
+                      <a:avLst/>
+                    </a:prstGeom>
+                    <a:noFill/>
+                    <a:ln w="9525">
+                      <a:noFill/>
+                      <a:headEnd/>
+                      <a:tailEnd/>
+                    </a:ln>
+                  </pic:spPr>
+                </pic:pic>
+              </a:graphicData>
+            </a:graphic>
+          </wp:inline>
+        </w:drawing>
+      </w:r>
+    </w:p>
+    <w:p>
+      <w:pPr>
+        <w:pStyle w:val="ImageCaption"/>
+      </w:pPr>
+      <w:r>
+        <w:t xml:space="preserve">Arquitectura</w:t>
       </w:r>
     </w:p>
     <w:tbl>
@@ -190,8 +326,8 @@
         <w:t xml:space="preserve">. Cada archivo admite hasta 2 GB; al abrir gestión nueva se parte de un archivo limpio.</w:t>
       </w:r>
     </w:p>
-    <w:bookmarkEnd w:id="20"/>
-    <w:bookmarkStart w:id="21" w:name="requisitos"/>
+    <w:bookmarkEnd w:id="23"/>
+    <w:bookmarkStart w:id="24" w:name="requisitos"/>
     <w:p>
       <w:pPr>
         <w:pStyle w:val="Heading2"/>
@@ -246,14 +382,50 @@
         <w:t xml:space="preserve">Para compilar: SDK .NET 8 (Linux/Windows). La interfaz solo ejecuta en Windows.</w:t>
       </w:r>
     </w:p>
-    <w:bookmarkEnd w:id="21"/>
-    <w:bookmarkStart w:id="22" w:name="compilación-y-publicación"/>
+    <w:bookmarkEnd w:id="24"/>
+    <w:bookmarkStart w:id="28" w:name="instalador-recomendado"/>
     <w:p>
       <w:pPr>
         <w:pStyle w:val="Heading2"/>
       </w:pPr>
       <w:r>
-        <w:t xml:space="preserve">3. Compilación y publicación</w:t>
+        <w:t xml:space="preserve">3. Instalador (recomendado)</w:t>
+      </w:r>
+    </w:p>
+    <w:p>
+      <w:pPr>
+        <w:pStyle w:val="FirstParagraph"/>
+      </w:pPr>
+      <w:r>
+        <w:t xml:space="preserve">Se genera con</w:t>
+      </w:r>
+      <w:r>
+        <w:t xml:space="preserve"> </w:t>
+      </w:r>
+      <w:r>
+        <w:rPr>
+          <w:bCs/>
+          <w:b/>
+        </w:rPr>
+        <w:t xml:space="preserve">Inno Setup 6</w:t>
+      </w:r>
+      <w:r>
+        <w:t xml:space="preserve"> </w:t>
+      </w:r>
+      <w:r>
+        <w:t xml:space="preserve">(script</w:t>
+      </w:r>
+      <w:r>
+        <w:t xml:space="preserve"> </w:t>
+      </w:r>
+      <w:r>
+        <w:rPr>
+          <w:rStyle w:val="VerbatimChar"/>
+        </w:rPr>
+        <w:t xml:space="preserve">instalador/ContaBol.iss</w:t>
+      </w:r>
+      <w:r>
+        <w:t xml:space="preserve">):</w:t>
       </w:r>
     </w:p>
     <w:p>
@@ -264,6 +436,177 @@
         <w:rPr>
           <w:rStyle w:val="VerbatimChar"/>
         </w:rPr>
+        <w:t xml:space="preserve">crear_instalador.bat x64      (o x86)</w:t>
+      </w:r>
+    </w:p>
+    <w:p>
+      <w:pPr>
+        <w:pStyle w:val="FirstParagraph"/>
+      </w:pPr>
+      <w:r>
+        <w:t xml:space="preserve">Produce</w:t>
+      </w:r>
+      <w:r>
+        <w:t xml:space="preserve"> </w:t>
+      </w:r>
+      <w:r>
+        <w:rPr>
+          <w:rStyle w:val="VerbatimChar"/>
+        </w:rPr>
+        <w:t xml:space="preserve">instalador\salida\ContaBol_Setup_x64.exe</w:t>
+      </w:r>
+      <w:r>
+        <w:t xml:space="preserve">: instala en</w:t>
+      </w:r>
+      <w:r>
+        <w:t xml:space="preserve"> </w:t>
+      </w:r>
+      <w:r>
+        <w:rPr>
+          <w:iCs/>
+          <w:i/>
+        </w:rPr>
+        <w:t xml:space="preserve">Archivos de programa</w:t>
+      </w:r>
+      <w:r>
+        <w:t xml:space="preserve">, crea accesos directos, detecta si falta Access Database Engine y registra el desinstalador.</w:t>
+      </w:r>
+      <w:r>
+        <w:t xml:space="preserve"> </w:t>
+      </w:r>
+      <w:r>
+        <w:t xml:space="preserve">En GitHub, el flujo</w:t>
+      </w:r>
+      <w:r>
+        <w:t xml:space="preserve"> </w:t>
+      </w:r>
+      <w:r>
+        <w:rPr>
+          <w:rStyle w:val="VerbatimChar"/>
+        </w:rPr>
+        <w:t xml:space="preserve">.github/workflows/instalador.yml</w:t>
+      </w:r>
+      <w:r>
+        <w:t xml:space="preserve"> </w:t>
+      </w:r>
+      <w:r>
+        <w:t xml:space="preserve">compila, ejecuta las 57 pruebas y construye ambos instaladores automáticamente en cada push (descargables en</w:t>
+      </w:r>
+      <w:r>
+        <w:t xml:space="preserve"> </w:t>
+      </w:r>
+      <w:r>
+        <w:rPr>
+          <w:iCs/>
+          <w:i/>
+        </w:rPr>
+        <w:t xml:space="preserve">Actions &gt; Artifacts</w:t>
+      </w:r>
+      <w:r>
+        <w:t xml:space="preserve">); al crear una etiqueta</w:t>
+      </w:r>
+      <w:r>
+        <w:t xml:space="preserve"> </w:t>
+      </w:r>
+      <w:r>
+        <w:rPr>
+          <w:rStyle w:val="VerbatimChar"/>
+        </w:rPr>
+        <w:t xml:space="preserve">v1.0.0</w:t>
+      </w:r>
+      <w:r>
+        <w:t xml:space="preserve"> </w:t>
+      </w:r>
+      <w:r>
+        <w:t xml:space="preserve">los publica en</w:t>
+      </w:r>
+      <w:r>
+        <w:t xml:space="preserve"> </w:t>
+      </w:r>
+      <w:r>
+        <w:rPr>
+          <w:iCs/>
+          <w:i/>
+        </w:rPr>
+        <w:t xml:space="preserve">Releases</w:t>
+      </w:r>
+      <w:r>
+        <w:t xml:space="preserve">.</w:t>
+      </w:r>
+    </w:p>
+    <w:p>
+      <w:pPr>
+        <w:pStyle w:val="CaptionedFigure"/>
+      </w:pPr>
+      <w:r>
+        <w:drawing>
+          <wp:inline>
+            <wp:extent cx="5334000" cy="1088571"/>
+            <wp:effectExtent b="0" l="0" r="0" t="0"/>
+            <wp:docPr descr="Flujo de instalación" title="" id="26" name="Picture"/>
+            <a:graphic>
+              <a:graphicData uri="http://schemas.openxmlformats.org/drawingml/2006/picture">
+                <pic:pic>
+                  <pic:nvPicPr>
+                    <pic:cNvPr descr="img/flujo_instalacion.png" id="27" name="Picture"/>
+                    <pic:cNvPicPr>
+                      <a:picLocks noChangeArrowheads="1" noChangeAspect="1"/>
+                    </pic:cNvPicPr>
+                  </pic:nvPicPr>
+                  <pic:blipFill>
+                    <a:blip r:embed="rId25"/>
+                    <a:stretch>
+                      <a:fillRect/>
+                    </a:stretch>
+                  </pic:blipFill>
+                  <pic:spPr bwMode="auto">
+                    <a:xfrm>
+                      <a:off x="0" y="0"/>
+                      <a:ext cx="5334000" cy="1088571"/>
+                    </a:xfrm>
+                    <a:prstGeom prst="rect">
+                      <a:avLst/>
+                    </a:prstGeom>
+                    <a:noFill/>
+                    <a:ln w="9525">
+                      <a:noFill/>
+                      <a:headEnd/>
+                      <a:tailEnd/>
+                    </a:ln>
+                  </pic:spPr>
+                </pic:pic>
+              </a:graphicData>
+            </a:graphic>
+          </wp:inline>
+        </w:drawing>
+      </w:r>
+    </w:p>
+    <w:p>
+      <w:pPr>
+        <w:pStyle w:val="ImageCaption"/>
+      </w:pPr>
+      <w:r>
+        <w:t xml:space="preserve">Flujo de instalación</w:t>
+      </w:r>
+    </w:p>
+    <w:bookmarkEnd w:id="28"/>
+    <w:bookmarkStart w:id="29" w:name="compilación-manual-y-publicación"/>
+    <w:p>
+      <w:pPr>
+        <w:pStyle w:val="Heading2"/>
+      </w:pPr>
+      <w:r>
+        <w:t xml:space="preserve">3.1 Compilación manual y publicación</w:t>
+      </w:r>
+    </w:p>
+    <w:p>
+      <w:pPr>
+        <w:pStyle w:val="SourceCode"/>
+      </w:pPr>
+      <w:r>
+        <w:rPr>
+          <w:rStyle w:val="VerbatimChar"/>
+        </w:rPr>
         <w:t xml:space="preserve">cd ContaBol</w:t>
       </w:r>
       <w:r>
@@ -299,7 +642,7 @@
         <w:rPr>
           <w:rStyle w:val="VerbatimChar"/>
         </w:rPr>
-        <w:t xml:space="preserve">publicar\win-x64\ContaBol.App.exe</w:t>
+        <w:t xml:space="preserve">publicar\win-x64\ContaBol.exe</w:t>
       </w:r>
       <w:r>
         <w:t xml:space="preserve"> </w:t>
@@ -320,8 +663,8 @@
         <w:t xml:space="preserve">).</w:t>
       </w:r>
     </w:p>
-    <w:bookmarkEnd w:id="22"/>
-    <w:bookmarkStart w:id="23" w:name="instalación-en-el-equipo"/>
+    <w:bookmarkEnd w:id="29"/>
+    <w:bookmarkStart w:id="30" w:name="instalación-en-el-equipo"/>
     <w:p>
       <w:pPr>
         <w:pStyle w:val="Heading2"/>
@@ -339,7 +682,17 @@
         <w:pStyle w:val="Compact"/>
       </w:pPr>
       <w:r>
-        <w:t xml:space="preserve">Instale Access Database Engine con la misma arquitectura que la aplicación. Si hay Office de 32 bits y necesita ACE de 64, instale con</w:t>
+        <w:rPr>
+          <w:bCs/>
+          <w:b/>
+        </w:rPr>
+        <w:t xml:space="preserve">Con instalador:</w:t>
+      </w:r>
+      <w:r>
+        <w:t xml:space="preserve"> </w:t>
+      </w:r>
+      <w:r>
+        <w:t xml:space="preserve">ejecute</w:t>
       </w:r>
       <w:r>
         <w:t xml:space="preserve"> </w:t>
@@ -348,10 +701,13 @@
         <w:rPr>
           <w:rStyle w:val="VerbatimChar"/>
         </w:rPr>
-        <w:t xml:space="preserve">AccessDatabaseEngine_X64.exe /quiet</w:t>
-      </w:r>
-      <w:r>
-        <w:t xml:space="preserve">.</w:t>
+        <w:t xml:space="preserve">ContaBol_Setup_x64.exe</w:t>
+      </w:r>
+      <w:r>
+        <w:t xml:space="preserve"> </w:t>
+      </w:r>
+      <w:r>
+        <w:t xml:space="preserve">(o x86), siga el asistente y abra ContaBol desde el escritorio. Los pasos siguientes aplican a la instalación manual (carpeta publicada).</w:t>
       </w:r>
     </w:p>
     <w:p>
@@ -363,7 +719,7 @@
         <w:pStyle w:val="Compact"/>
       </w:pPr>
       <w:r>
-        <w:t xml:space="preserve">Copie la carpeta publicada. Cree un acceso directo a</w:t>
+        <w:t xml:space="preserve">Instale Access Database Engine con la misma arquitectura que la aplicación. Si hay Office de 32 bits y necesita ACE de 64, instale con</w:t>
       </w:r>
       <w:r>
         <w:t xml:space="preserve"> </w:t>
@@ -372,7 +728,7 @@
         <w:rPr>
           <w:rStyle w:val="VerbatimChar"/>
         </w:rPr>
-        <w:t xml:space="preserve">ContaBol.App.exe</w:t>
+        <w:t xml:space="preserve">AccessDatabaseEngine_X64.exe /quiet</w:t>
       </w:r>
       <w:r>
         <w:t xml:space="preserve">.</w:t>
@@ -387,20 +743,7 @@
         <w:pStyle w:val="Compact"/>
       </w:pPr>
       <w:r>
-        <w:t xml:space="preserve">Al primer arranque se crea la carpeta de datos (por defecto en el perfil del usuario; se muestra en</w:t>
-      </w:r>
-      <w:r>
-        <w:t xml:space="preserve"> </w:t>
-      </w:r>
-      <w:r>
-        <w:rPr>
-          <w:iCs/>
-          <w:i/>
-        </w:rPr>
-        <w:t xml:space="preserve">Ayuda &gt; Acerca de</w:t>
-      </w:r>
-      <w:r>
-        <w:t xml:space="preserve">). Para red, configure una carpeta compartida en</w:t>
+        <w:t xml:space="preserve">Copie la carpeta publicada. Cree un acceso directo a</w:t>
       </w:r>
       <w:r>
         <w:t xml:space="preserve"> </w:t>
@@ -409,13 +752,10 @@
         <w:rPr>
           <w:rStyle w:val="VerbatimChar"/>
         </w:rPr>
-        <w:t xml:space="preserve">AppSettings</w:t>
-      </w:r>
-      <w:r>
-        <w:t xml:space="preserve"> </w:t>
-      </w:r>
-      <w:r>
-        <w:t xml:space="preserve">(ruta de datos) con permiso de lectura/escritura para todos los usuarios.</w:t>
+        <w:t xml:space="preserve">ContaBol.exe</w:t>
+      </w:r>
+      <w:r>
+        <w:t xml:space="preserve">.</w:t>
       </w:r>
     </w:p>
     <w:p>
@@ -427,6 +767,46 @@
         <w:pStyle w:val="Compact"/>
       </w:pPr>
       <w:r>
+        <w:t xml:space="preserve">Al primer arranque se crea la carpeta de datos (por defecto en el perfil del usuario; se muestra en</w:t>
+      </w:r>
+      <w:r>
+        <w:t xml:space="preserve"> </w:t>
+      </w:r>
+      <w:r>
+        <w:rPr>
+          <w:iCs/>
+          <w:i/>
+        </w:rPr>
+        <w:t xml:space="preserve">Ayuda &gt; Acerca de</w:t>
+      </w:r>
+      <w:r>
+        <w:t xml:space="preserve">). Para red, configure una carpeta compartida en</w:t>
+      </w:r>
+      <w:r>
+        <w:t xml:space="preserve"> </w:t>
+      </w:r>
+      <w:r>
+        <w:rPr>
+          <w:rStyle w:val="VerbatimChar"/>
+        </w:rPr>
+        <w:t xml:space="preserve">AppSettings</w:t>
+      </w:r>
+      <w:r>
+        <w:t xml:space="preserve"> </w:t>
+      </w:r>
+      <w:r>
+        <w:t xml:space="preserve">(ruta de datos) con permiso de lectura/escritura para todos los usuarios.</w:t>
+      </w:r>
+    </w:p>
+    <w:p>
+      <w:pPr>
+        <w:numPr>
+          <w:ilvl w:val="0"/>
+          <w:numId w:val="1002"/>
+        </w:numPr>
+        <w:pStyle w:val="Compact"/>
+      </w:pPr>
+      <w:r>
         <w:t xml:space="preserve">Ingrese con</w:t>
       </w:r>
       <w:r>
@@ -460,8 +840,8 @@
         <w:t xml:space="preserve">y cambie la clave (se exige).</w:t>
       </w:r>
     </w:p>
-    <w:bookmarkEnd w:id="23"/>
-    <w:bookmarkStart w:id="24" w:name="despliegue-en-red-varios-usuarios"/>
+    <w:bookmarkEnd w:id="30"/>
+    <w:bookmarkStart w:id="31" w:name="despliegue-en-red-varios-usuarios"/>
     <w:p>
       <w:pPr>
         <w:pStyle w:val="Heading2"/>
@@ -542,8 +922,8 @@
         <w:t xml:space="preserve">: se puede añadir un proveedor SQL Server sin cambiar los servicios.</w:t>
       </w:r>
     </w:p>
-    <w:bookmarkEnd w:id="24"/>
-    <w:bookmarkStart w:id="25" w:name="puesta-en-marcha-de-una-empresa"/>
+    <w:bookmarkEnd w:id="31"/>
+    <w:bookmarkStart w:id="32" w:name="puesta-en-marcha-de-una-empresa"/>
     <w:p>
       <w:pPr>
         <w:pStyle w:val="Heading2"/>
@@ -675,8 +1055,8 @@
         <w:t xml:space="preserve">, seleccione la carpeta de la gestión (con PRU.MDB, ORION.MDB, INVENT.MDB). Se crea una empresa nueva; revise los avisos.</w:t>
       </w:r>
     </w:p>
-    <w:bookmarkEnd w:id="25"/>
-    <w:bookmarkStart w:id="26" w:name="respaldos-y-recuperación"/>
+    <w:bookmarkEnd w:id="32"/>
+    <w:bookmarkStart w:id="33" w:name="respaldos-y-recuperación"/>
     <w:p>
       <w:pPr>
         <w:pStyle w:val="Heading2"/>
@@ -777,8 +1157,8 @@
         <w:t xml:space="preserve">mensualmente (reduce tamaño y repara).</w:t>
       </w:r>
     </w:p>
-    <w:bookmarkEnd w:id="26"/>
-    <w:bookmarkStart w:id="27" w:name="mantenimiento-y-soporte"/>
+    <w:bookmarkEnd w:id="33"/>
+    <w:bookmarkStart w:id="34" w:name="mantenimiento-y-soporte"/>
     <w:p>
       <w:pPr>
         <w:pStyle w:val="Heading2"/>
@@ -878,8 +1258,8 @@
         <w:t xml:space="preserve">(traslada saldos, existencias, cuentas corrientes y activos).</w:t>
       </w:r>
     </w:p>
-    <w:bookmarkEnd w:id="27"/>
-    <w:bookmarkStart w:id="28" w:name="seguridad"/>
+    <w:bookmarkEnd w:id="34"/>
+    <w:bookmarkStart w:id="35" w:name="seguridad"/>
     <w:p>
       <w:pPr>
         <w:pStyle w:val="Heading2"/>
@@ -896,8 +1276,8 @@
         <w:t xml:space="preserve">Claves con PBKDF2; permisos por opción y empresa; gestión cerrada es de solo lectura. Restrinja la carpeta de datos con permisos NTFS y cifre los respaldos externos.</w:t>
       </w:r>
     </w:p>
-    <w:bookmarkEnd w:id="28"/>
-    <w:bookmarkStart w:id="29" w:name="limitaciones-conocidas"/>
+    <w:bookmarkEnd w:id="35"/>
+    <w:bookmarkStart w:id="36" w:name="limitaciones-conocidas"/>
     <w:p>
       <w:pPr>
         <w:pStyle w:val="Heading2"/>
@@ -958,8 +1338,7 @@
         <w:t xml:space="preserve">La importación de Orion4 no migra movimientos de inventario.</w:t>
       </w:r>
     </w:p>
-    <w:bookmarkEnd w:id="29"/>
-    <w:bookmarkEnd w:id="30"/>
+    <w:bookmarkEnd w:id="36"/>
     <w:sectPr/>
   </w:body>
 </w:document>
@@ -1142,6 +1521,91 @@
       </w:pPr>
     </w:lvl>
   </w:abstractNum>
+  <w:abstractNum w:abstractNumId="99410">
+    <w:nsid w:val="A99410"/>
+    <w:multiLevelType w:val="multilevel"/>
+    <w:lvl w:ilvl="0">
+      <w:start w:val="0"/>
+      <w:numFmt w:val="decimal"/>
+      <w:lvlText w:val="%1."/>
+      <w:lvlJc w:val="left"/>
+      <w:pPr>
+        <w:ind w:left="720" w:hanging="480"/>
+      </w:pPr>
+    </w:lvl>
+    <w:lvl w:ilvl="1">
+      <w:start w:val="0"/>
+      <w:numFmt w:val="decimal"/>
+      <w:lvlText w:val="%2."/>
+      <w:lvlJc w:val="left"/>
+      <w:pPr>
+        <w:ind w:left="1440" w:hanging="480"/>
+      </w:pPr>
+    </w:lvl>
+    <w:lvl w:ilvl="2">
+      <w:start w:val="0"/>
+      <w:numFmt w:val="decimal"/>
+      <w:lvlText w:val="%3."/>
+      <w:lvlJc w:val="left"/>
+      <w:pPr>
+        <w:ind w:left="2160" w:hanging="480"/>
+      </w:pPr>
+    </w:lvl>
+    <w:lvl w:ilvl="3">
+      <w:start w:val="0"/>
+      <w:numFmt w:val="decimal"/>
+      <w:lvlText w:val="%4."/>
+      <w:lvlJc w:val="left"/>
+      <w:pPr>
+        <w:ind w:left="2880" w:hanging="480"/>
+      </w:pPr>
+    </w:lvl>
+    <w:lvl w:ilvl="4">
+      <w:start w:val="0"/>
+      <w:numFmt w:val="decimal"/>
+      <w:lvlText w:val="%5."/>
+      <w:lvlJc w:val="left"/>
+      <w:pPr>
+        <w:ind w:left="3600" w:hanging="480"/>
+      </w:pPr>
+    </w:lvl>
+    <w:lvl w:ilvl="5">
+      <w:start w:val="0"/>
+      <w:numFmt w:val="decimal"/>
+      <w:lvlText w:val="%6."/>
+      <w:lvlJc w:val="left"/>
+      <w:pPr>
+        <w:ind w:left="4320" w:hanging="480"/>
+      </w:pPr>
+    </w:lvl>
+    <w:lvl w:ilvl="6">
+      <w:start w:val="0"/>
+      <w:numFmt w:val="decimal"/>
+      <w:lvlText w:val="%7."/>
+      <w:lvlJc w:val="left"/>
+      <w:pPr>
+        <w:ind w:left="5040" w:hanging="480"/>
+      </w:pPr>
+    </w:lvl>
+    <w:lvl w:ilvl="7">
+      <w:start w:val="0"/>
+      <w:numFmt w:val="decimal"/>
+      <w:lvlText w:val="%8."/>
+      <w:lvlJc w:val="left"/>
+      <w:pPr>
+        <w:ind w:left="5760" w:hanging="480"/>
+      </w:pPr>
+    </w:lvl>
+    <w:lvl w:ilvl="8">
+      <w:start w:val="0"/>
+      <w:numFmt w:val="decimal"/>
+      <w:lvlText w:val="%9."/>
+      <w:lvlJc w:val="left"/>
+      <w:pPr>
+        <w:ind w:left="6480" w:hanging="480"/>
+      </w:pPr>
+    </w:lvl>
+  </w:abstractNum>
   <w:abstractNum w:abstractNumId="99411">
     <w:nsid w:val="A99411"/>
     <w:multiLevelType w:val="multilevel"/>
@@ -1234,33 +1698,33 @@
     <w:abstractNumId w:val="991"/>
   </w:num>
   <w:num w:numId="1002">
-    <w:abstractNumId w:val="99411"/>
+    <w:abstractNumId w:val="99410"/>
     <w:lvlOverride w:ilvl="0">
-      <w:startOverride w:val="1"/>
+      <w:startOverride w:val="0"/>
     </w:lvlOverride>
     <w:lvlOverride w:ilvl="1">
-      <w:startOverride w:val="1"/>
+      <w:startOverride w:val="0"/>
     </w:lvlOverride>
     <w:lvlOverride w:ilvl="2">
-      <w:startOverride w:val="1"/>
+      <w:startOverride w:val="0"/>
     </w:lvlOverride>
     <w:lvlOverride w:ilvl="3">
-      <w:startOverride w:val="1"/>
+      <w:startOverride w:val="0"/>
     </w:lvlOverride>
     <w:lvlOverride w:ilvl="4">
-      <w:startOverride w:val="1"/>
+      <w:startOverride w:val="0"/>
     </w:lvlOverride>
     <w:lvlOverride w:ilvl="5">
-      <w:startOverride w:val="1"/>
+      <w:startOverride w:val="0"/>
     </w:lvlOverride>
     <w:lvlOverride w:ilvl="6">
-      <w:startOverride w:val="1"/>
+      <w:startOverride w:val="0"/>
     </w:lvlOverride>
     <w:lvlOverride w:ilvl="7">
-      <w:startOverride w:val="1"/>
+      <w:startOverride w:val="0"/>
     </w:lvlOverride>
     <w:lvlOverride w:ilvl="8">
-      <w:startOverride w:val="1"/>
+      <w:startOverride w:val="0"/>
     </w:lvlOverride>
   </w:num>
   <w:num w:numId="1003">

</xml_diff>